<commit_message>
docs: finalize compliance report and Canvas PDF
Co-authored-by: Copilot <223556219+Copilot@users.noreply.github.com>
</commit_message>
<xml_diff>
--- a/Documentacion_Prestamos_Lab_0902-22-7467_Final.docx
+++ b/Documentacion_Prestamos_Lab_0902-22-7467_Final.docx
@@ -1309,18 +1309,8 @@
             <w:vAlign w:val="center"/>
           </w:tcPr>
           <w:p>
-            <w:pPr>
-              <w:spacing w:after="20"/>
-            </w:pPr>
-            <w:r/>
             <w:r>
-              <w:rPr>
-                <w:rFonts w:ascii="Aptos" w:hAnsi="Aptos"/>
-                <w:b w:val="0"/>
-                <w:color w:val="173342"/>
-                <w:sz w:val="17"/>
-              </w:rPr>
-              <w:t>id, nombre, categoria, disponible.</w:t>
+              <w:t>id: number; nombre: string; categoria: string; disponible: boolean.</w:t>
             </w:r>
           </w:p>
         </w:tc>
@@ -1355,18 +1345,8 @@
             <w:shd w:fill="F4F7F8"/>
           </w:tcPr>
           <w:p>
-            <w:pPr>
-              <w:spacing w:after="20"/>
-            </w:pPr>
-            <w:r/>
             <w:r>
-              <w:rPr>
-                <w:rFonts w:ascii="Aptos" w:hAnsi="Aptos"/>
-                <w:b w:val="0"/>
-                <w:color w:val="173342"/>
-                <w:sz w:val="17"/>
-              </w:rPr>
-              <w:t>id, equipoId, solicitante, carne, fechaPrestamo, fechaLimite, devuelto.</w:t>
+              <w:t>id: number; equipoId: number; solicitante: string; carne: string; fechaPrestamo: string (ISO 8601); fechaLimite: string (ISO 8601); devuelto: boolean.</w:t>
             </w:r>
           </w:p>
         </w:tc>
@@ -2320,12 +2300,21 @@
     </w:p>
     <w:p>
       <w:r>
-        <w:t>Repositorio público de la entrega: https://github.com/cligorriaf-sketch/gestor-prestamos-lab</w:t>
+        <w:t xml:space="preserve">Repositorio público de la entrega: </w:t>
       </w:r>
+      <w:hyperlink r:id="rId16">
+        <w:r>
+          <w:rPr>
+            <w:color w:val="176C64"/>
+            <w:u w:val="single"/>
+          </w:rPr>
+          <w:t>https://github.com/cligorriaf-sketch/gestor-prestamos-lab</w:t>
+        </w:r>
+      </w:hyperlink>
     </w:p>
     <w:p>
       <w:r>
-        <w:t>El proyecto está publicado como repositorio público en GitHub y contiene seis commits de avance en la rama main. El historial documenta el scaffolding, las vistas y componentes tipados, la API y el hook, los flujos de préstamo, la guía y datos iniciales, y el informe con capturas.</w:t>
+        <w:t>El repositorio es público y la rama main contiene siete commits de avance, superando el mínimo de seis solicitado. El historial documenta el scaffold, las vistas y componentes tipados, la integración REST, los flujos de préstamo, la guía de ejecución, las evidencias y el enlace final.</w:t>
       </w:r>
     </w:p>
     <w:tbl>
@@ -2457,18 +2446,8 @@
             <w:vAlign w:val="center"/>
           </w:tcPr>
           <w:p>
-            <w:pPr>
-              <w:spacing w:after="20"/>
-            </w:pPr>
-            <w:r/>
             <w:r>
-              <w:rPr>
-                <w:rFonts w:ascii="Aptos" w:hAnsi="Aptos"/>
-                <w:b w:val="0"/>
-                <w:color w:val="173342"/>
-                <w:sz w:val="17"/>
-              </w:rPr>
-              <w:t>Estructura y dependencias.</w:t>
+              <w:t>Estructura base y dependencias.</w:t>
             </w:r>
           </w:p>
         </w:tc>
@@ -2803,6 +2782,38 @@
                 <w:sz w:val="17"/>
               </w:rPr>
               <w:t>Informe y capturas.</w:t>
+            </w:r>
+          </w:p>
+        </w:tc>
+      </w:tr>
+      <w:tr>
+        <w:tc>
+          <w:tcPr>
+            <w:tcW w:type="dxa" w:w="3312"/>
+          </w:tcPr>
+          <w:p>
+            <w:r>
+              <w:t>7</w:t>
+            </w:r>
+          </w:p>
+        </w:tc>
+        <w:tc>
+          <w:tcPr>
+            <w:tcW w:type="dxa" w:w="3312"/>
+          </w:tcPr>
+          <w:p>
+            <w:r>
+              <w:t>docs: add public repository link to final report</w:t>
+            </w:r>
+          </w:p>
+        </w:tc>
+        <w:tc>
+          <w:tcPr>
+            <w:tcW w:type="dxa" w:w="3312"/>
+          </w:tcPr>
+          <w:p>
+            <w:r>
+              <w:t>Enlace al repositorio y documento final publicados.</w:t>
             </w:r>
           </w:p>
         </w:tc>

</xml_diff>